<commit_message>
docs(manual): capturas por rol y lista de mejoras de la prueba de usuario
Agrega al Manual de Usuario 105 capturas de los cinco roles (cliente,
administrador, barbero, recepción e ingeniero) tomadas en un entorno de
demostración aislado, y corrige RF-01 y RN-13 en análisis y requerimientos.
Incluye los scripts de la demostración, el soporte JPG del generador de Word
y la lista priorizada de mejoras detectadas.
</commit_message>
<xml_diff>
--- a/docs/manuales/03-analisis-y-requerimientos/analisis-y-requerimientos.docx
+++ b/docs/manuales/03-analisis-y-requerimientos/analisis-y-requerimientos.docx
@@ -3804,7 +3804,7 @@
                 <w:sz w:val="17"/>
                 <w:szCs w:val="17"/>
               </w:rPr>
-              <w:t xml:space="preserve">El sistema debe registrar clientes con correo, teléfono y contraseña, y verificar el correo.</w:t>
+              <w:t xml:space="preserve">El sistema debe registrar clientes con nombre, correo y contraseña (la cuenta queda activa sin código de verificación) y completar teléfono, fecha de nacimiento y sexo en el perfil.</w:t>
             </w:r>
           </w:p>
         </w:tc>
@@ -6954,6 +6954,97 @@
                 <w:szCs w:val="17"/>
               </w:rPr>
               <w:t xml:space="preserve">Los comprobantes de pago se sirven con URL temporal; no son públicos.</w:t>
+            </w:r>
+          </w:p>
+        </w:tc>
+      </w:tr>
+      <w:tr>
+        <w:trPr>
+          <w:cantSplit/>
+        </w:trPr>
+        <w:tc>
+          <w:tcPr>
+            <w:tcW w:type="dxa" w:w="1186"/>
+            <w:tcBorders>
+              <w:top w:val="single" w:color="BFBFBF" w:sz="4"/>
+              <w:left w:val="single" w:color="BFBFBF" w:sz="4"/>
+              <w:bottom w:val="single" w:color="BFBFBF" w:sz="4"/>
+              <w:right w:val="single" w:color="BFBFBF" w:sz="4"/>
+            </w:tcBorders>
+            <w:tcMar>
+              <w:top w:type="dxa" w:w="60"/>
+              <w:left w:type="dxa" w:w="90"/>
+              <w:bottom w:type="dxa" w:w="60"/>
+              <w:right w:type="dxa" w:w="90"/>
+            </w:tcMar>
+            <w:vAlign w:val="top"/>
+          </w:tcPr>
+          <w:p>
+            <w:pPr>
+              <w:spacing w:after="20" w:line="250"/>
+            </w:pPr>
+            <w:r>
+              <w:rPr>
+                <w:rFonts w:ascii="Arial" w:cs="Arial" w:eastAsia="Arial" w:hAnsi="Arial"/>
+                <w:b/>
+                <w:bCs/>
+                <w:color w:val="1F1F1F"/>
+                <w:sz w:val="17"/>
+                <w:szCs w:val="17"/>
+              </w:rPr>
+              <w:t xml:space="preserve">RN-13</w:t>
+            </w:r>
+          </w:p>
+        </w:tc>
+        <w:tc>
+          <w:tcPr>
+            <w:tcW w:type="dxa" w:w="8894"/>
+            <w:tcBorders>
+              <w:top w:val="single" w:color="BFBFBF" w:sz="4"/>
+              <w:left w:val="single" w:color="BFBFBF" w:sz="4"/>
+              <w:bottom w:val="single" w:color="BFBFBF" w:sz="4"/>
+              <w:right w:val="single" w:color="BFBFBF" w:sz="4"/>
+            </w:tcBorders>
+            <w:tcMar>
+              <w:top w:type="dxa" w:w="60"/>
+              <w:left w:type="dxa" w:w="90"/>
+              <w:bottom w:type="dxa" w:w="60"/>
+              <w:right w:type="dxa" w:w="90"/>
+            </w:tcMar>
+            <w:vAlign w:val="top"/>
+          </w:tcPr>
+          <w:p>
+            <w:pPr>
+              <w:spacing w:after="20" w:line="250"/>
+            </w:pPr>
+            <w:r>
+              <w:rPr>
+                <w:rFonts w:ascii="Arial" w:cs="Arial" w:eastAsia="Arial" w:hAnsi="Arial"/>
+                <w:color w:val="1F1F1F"/>
+                <w:sz w:val="17"/>
+                <w:szCs w:val="17"/>
+              </w:rPr>
+              <w:t xml:space="preserve">Un cliente solo puede tener </w:t>
+            </w:r>
+            <w:r>
+              <w:rPr>
+                <w:rFonts w:ascii="Arial" w:cs="Arial" w:eastAsia="Arial" w:hAnsi="Arial"/>
+                <w:b/>
+                <w:bCs/>
+                <w:color w:val="1F1F1F"/>
+                <w:sz w:val="17"/>
+                <w:szCs w:val="17"/>
+              </w:rPr>
+              <w:t xml:space="preserve">una cita por día</w:t>
+            </w:r>
+            <w:r>
+              <w:rPr>
+                <w:rFonts w:ascii="Arial" w:cs="Arial" w:eastAsia="Arial" w:hAnsi="Arial"/>
+                <w:color w:val="1F1F1F"/>
+                <w:sz w:val="17"/>
+                <w:szCs w:val="17"/>
+              </w:rPr>
+              <w:t xml:space="preserve">.</w:t>
             </w:r>
           </w:p>
         </w:tc>

</xml_diff>